<commit_message>
Include normalized motif quantity and qualify six-mer candidate selection
</commit_message>
<xml_diff>
--- a/results/00_model_selection/unified_quality_review_zh.docx
+++ b/results/00_model_selection/unified_quality_review_zh.docx
@@ -19,7 +19,7 @@
       <w:r>
         <w:drawing>
           <wp:inline xmlns:a="http://schemas.openxmlformats.org/drawingml/2006/main" xmlns:pic="http://schemas.openxmlformats.org/drawingml/2006/picture">
-            <wp:extent cx="9180000" cy="3156352"/>
+            <wp:extent cx="6120000" cy="4280496"/>
             <wp:docPr id="1" name="Picture 1"/>
             <wp:cNvGraphicFramePr>
               <a:graphicFrameLocks noChangeAspect="1"/>
@@ -40,7 +40,7 @@
                   <pic:spPr>
                     <a:xfrm>
                       <a:off x="0" y="0"/>
-                      <a:ext cx="9180000" cy="3156352"/>
+                      <a:ext cx="6120000" cy="4280496"/>
                     </a:xfrm>
                     <a:prstGeom prst="rect"/>
                   </pic:spPr>
@@ -53,7 +53,7 @@
     </w:p>
     <w:p>
       <w:r>
-        <w:t>前三行分别是各40批次中6-mer最佳的候选；末行为原UViT位置WD最佳候选。新WD为本次统一扫描重算值，与旧图不同版本或不同参照的WD不可直接混用。</w:t>
+        <w:t>前三行分别是各40批次中6-mer最佳的候选；额外保留DiT1050和原UViT位置WD候选。新增motif命中密度，以接近真实参照38.295次/序列为目标，而非越多越好。新WD为本次统一扫描重算值，与旧图不同版本或不同参照的WD不可直接混用。</w:t>
       </w:r>
     </w:p>
     <w:p>
@@ -76,15 +76,16 @@
         <w:tblLook w:firstColumn="1" w:firstRow="1" w:lastColumn="0" w:lastRow="0" w:noHBand="0" w:noVBand="1" w:val="04A0"/>
       </w:tblPr>
       <w:tblGrid>
-        <w:gridCol w:w="3642"/>
-        <w:gridCol w:w="3642"/>
-        <w:gridCol w:w="3642"/>
-        <w:gridCol w:w="3642"/>
+        <w:gridCol w:w="1928"/>
+        <w:gridCol w:w="1928"/>
+        <w:gridCol w:w="1928"/>
+        <w:gridCol w:w="1928"/>
+        <w:gridCol w:w="1928"/>
       </w:tblGrid>
       <w:tr>
         <w:tc>
           <w:tcPr>
-            <w:tcW w:type="dxa" w:w="3642"/>
+            <w:tcW w:type="dxa" w:w="1928"/>
           </w:tcPr>
           <w:p>
             <w:r>
@@ -94,7 +95,7 @@
         </w:tc>
         <w:tc>
           <w:tcPr>
-            <w:tcW w:type="dxa" w:w="3642"/>
+            <w:tcW w:type="dxa" w:w="1928"/>
           </w:tcPr>
           <w:p>
             <w:r>
@@ -104,7 +105,7 @@
         </w:tc>
         <w:tc>
           <w:tcPr>
-            <w:tcW w:type="dxa" w:w="3642"/>
+            <w:tcW w:type="dxa" w:w="1928"/>
           </w:tcPr>
           <w:p>
             <w:r>
@@ -114,7 +115,7 @@
         </w:tc>
         <w:tc>
           <w:tcPr>
-            <w:tcW w:type="dxa" w:w="3642"/>
+            <w:tcW w:type="dxa" w:w="1928"/>
           </w:tcPr>
           <w:p>
             <w:r>
@@ -122,11 +123,21 @@
             </w:r>
           </w:p>
         </w:tc>
+        <w:tc>
+          <w:tcPr>
+            <w:tcW w:type="dxa" w:w="1928"/>
+          </w:tcPr>
+          <w:p>
+            <w:r>
+              <w:t>命中/序列</w:t>
+            </w:r>
+          </w:p>
+        </w:tc>
       </w:tr>
       <w:tr>
         <w:tc>
           <w:tcPr>
-            <w:tcW w:type="dxa" w:w="3642"/>
+            <w:tcW w:type="dxa" w:w="1928"/>
           </w:tcPr>
           <w:p>
             <w:r>
@@ -136,7 +147,7 @@
         </w:tc>
         <w:tc>
           <w:tcPr>
-            <w:tcW w:type="dxa" w:w="3642"/>
+            <w:tcW w:type="dxa" w:w="1928"/>
           </w:tcPr>
           <w:p>
             <w:r>
@@ -146,7 +157,7 @@
         </w:tc>
         <w:tc>
           <w:tcPr>
-            <w:tcW w:type="dxa" w:w="3642"/>
+            <w:tcW w:type="dxa" w:w="1928"/>
           </w:tcPr>
           <w:p>
             <w:r>
@@ -156,7 +167,7 @@
         </w:tc>
         <w:tc>
           <w:tcPr>
-            <w:tcW w:type="dxa" w:w="3642"/>
+            <w:tcW w:type="dxa" w:w="1928"/>
           </w:tcPr>
           <w:p>
             <w:r>
@@ -164,11 +175,21 @@
             </w:r>
           </w:p>
         </w:tc>
+        <w:tc>
+          <w:tcPr>
+            <w:tcW w:type="dxa" w:w="1928"/>
+          </w:tcPr>
+          <w:p>
+            <w:r>
+              <w:t>33.404</w:t>
+            </w:r>
+          </w:p>
+        </w:tc>
       </w:tr>
       <w:tr>
         <w:tc>
           <w:tcPr>
-            <w:tcW w:type="dxa" w:w="3642"/>
+            <w:tcW w:type="dxa" w:w="1928"/>
           </w:tcPr>
           <w:p>
             <w:r>
@@ -178,7 +199,7 @@
         </w:tc>
         <w:tc>
           <w:tcPr>
-            <w:tcW w:type="dxa" w:w="3642"/>
+            <w:tcW w:type="dxa" w:w="1928"/>
           </w:tcPr>
           <w:p>
             <w:r>
@@ -188,7 +209,7 @@
         </w:tc>
         <w:tc>
           <w:tcPr>
-            <w:tcW w:type="dxa" w:w="3642"/>
+            <w:tcW w:type="dxa" w:w="1928"/>
           </w:tcPr>
           <w:p>
             <w:r>
@@ -198,7 +219,7 @@
         </w:tc>
         <w:tc>
           <w:tcPr>
-            <w:tcW w:type="dxa" w:w="3642"/>
+            <w:tcW w:type="dxa" w:w="1928"/>
           </w:tcPr>
           <w:p>
             <w:r>
@@ -206,11 +227,73 @@
             </w:r>
           </w:p>
         </w:tc>
+        <w:tc>
+          <w:tcPr>
+            <w:tcW w:type="dxa" w:w="1928"/>
+          </w:tcPr>
+          <w:p>
+            <w:r>
+              <w:t>31.601</w:t>
+            </w:r>
+          </w:p>
+        </w:tc>
       </w:tr>
       <w:tr>
         <w:tc>
           <w:tcPr>
-            <w:tcW w:type="dxa" w:w="3642"/>
+            <w:tcW w:type="dxa" w:w="1928"/>
+          </w:tcPr>
+          <w:p>
+            <w:r>
+              <w:t>DiT / 1050</w:t>
+            </w:r>
+          </w:p>
+        </w:tc>
+        <w:tc>
+          <w:tcPr>
+            <w:tcW w:type="dxa" w:w="1928"/>
+          </w:tcPr>
+          <w:p>
+            <w:r>
+              <w:t>0.935761</w:t>
+            </w:r>
+          </w:p>
+        </w:tc>
+        <w:tc>
+          <w:tcPr>
+            <w:tcW w:type="dxa" w:w="1928"/>
+          </w:tcPr>
+          <w:p>
+            <w:r>
+              <w:t>0.038939</w:t>
+            </w:r>
+          </w:p>
+        </w:tc>
+        <w:tc>
+          <w:tcPr>
+            <w:tcW w:type="dxa" w:w="1928"/>
+          </w:tcPr>
+          <w:p>
+            <w:r>
+              <w:t>0.877234</w:t>
+            </w:r>
+          </w:p>
+        </w:tc>
+        <w:tc>
+          <w:tcPr>
+            <w:tcW w:type="dxa" w:w="1928"/>
+          </w:tcPr>
+          <w:p>
+            <w:r>
+              <w:t>36.896</w:t>
+            </w:r>
+          </w:p>
+        </w:tc>
+      </w:tr>
+      <w:tr>
+        <w:tc>
+          <w:tcPr>
+            <w:tcW w:type="dxa" w:w="1928"/>
           </w:tcPr>
           <w:p>
             <w:r>
@@ -220,7 +303,7 @@
         </w:tc>
         <w:tc>
           <w:tcPr>
-            <w:tcW w:type="dxa" w:w="3642"/>
+            <w:tcW w:type="dxa" w:w="1928"/>
           </w:tcPr>
           <w:p>
             <w:r>
@@ -230,7 +313,7 @@
         </w:tc>
         <w:tc>
           <w:tcPr>
-            <w:tcW w:type="dxa" w:w="3642"/>
+            <w:tcW w:type="dxa" w:w="1928"/>
           </w:tcPr>
           <w:p>
             <w:r>
@@ -240,7 +323,7 @@
         </w:tc>
         <w:tc>
           <w:tcPr>
-            <w:tcW w:type="dxa" w:w="3642"/>
+            <w:tcW w:type="dxa" w:w="1928"/>
           </w:tcPr>
           <w:p>
             <w:r>
@@ -248,11 +331,21 @@
             </w:r>
           </w:p>
         </w:tc>
+        <w:tc>
+          <w:tcPr>
+            <w:tcW w:type="dxa" w:w="1928"/>
+          </w:tcPr>
+          <w:p>
+            <w:r>
+              <w:t>30.287</w:t>
+            </w:r>
+          </w:p>
+        </w:tc>
       </w:tr>
       <w:tr>
         <w:tc>
           <w:tcPr>
-            <w:tcW w:type="dxa" w:w="3642"/>
+            <w:tcW w:type="dxa" w:w="1928"/>
           </w:tcPr>
           <w:p>
             <w:r>
@@ -262,7 +355,7 @@
         </w:tc>
         <w:tc>
           <w:tcPr>
-            <w:tcW w:type="dxa" w:w="3642"/>
+            <w:tcW w:type="dxa" w:w="1928"/>
           </w:tcPr>
           <w:p>
             <w:r>
@@ -272,7 +365,7 @@
         </w:tc>
         <w:tc>
           <w:tcPr>
-            <w:tcW w:type="dxa" w:w="3642"/>
+            <w:tcW w:type="dxa" w:w="1928"/>
           </w:tcPr>
           <w:p>
             <w:r>
@@ -282,11 +375,21 @@
         </w:tc>
         <w:tc>
           <w:tcPr>
-            <w:tcW w:type="dxa" w:w="3642"/>
+            <w:tcW w:type="dxa" w:w="1928"/>
           </w:tcPr>
           <w:p>
             <w:r>
               <w:t>0.404726</w:t>
+            </w:r>
+          </w:p>
+        </w:tc>
+        <w:tc>
+          <w:tcPr>
+            <w:tcW w:type="dxa" w:w="1928"/>
+          </w:tcPr>
+          <w:p>
+            <w:r>
+              <w:t>31.472</w:t>
             </w:r>
           </w:p>
         </w:tc>
@@ -295,6 +398,11 @@
     <w:p>
       <w:r>
         <w:t>DDPM1800与DiT1200的6-mer PCC接近（差值约0.000119，未证明显著差异）；DiT的GC距离略低，而DDPM的motif位置距离更低。相较本轮UViT-v2 config4候选，DDPM的6-mer及GC更接近参照，但UViT的位置WD更低。选择DDPM的理由可表述为兼顾局部序列组成与motif位置分布，不应写成所有指标最佳。</w:t>
+      </w:r>
+    </w:p>
+    <w:p>
+      <w:r>
+        <w:t>加入数量后，DiT1050为36.896次/序列，最接近真实参照38.295；DDPM1800为33.404。6-mer最高仅适合初筛，未对全部120个checkpoint完成新协议的四指标联合扫描，不能将当前候选称为综合最优。最终应先确定主指标、质量门槛与同等候选筛选规则，避免只比较对DDPM有利的批次。</w:t>
       </w:r>
     </w:p>
     <w:p>
@@ -313,7 +421,7 @@
       </w:r>
     </w:p>
     <w:sectPr>
-      <w:pgSz w:w="16838" w:h="11906"/>
+      <w:pgSz w:w="11906" w:h="16838"/>
       <w:pgMar w:top="1134" w:right="1134" w:bottom="1134" w:left="1134" w:header="720" w:footer="720" w:gutter="0"/>
       <w:cols w:space="720"/>
       <w:docGrid w:linePitch="360"/>

</xml_diff>